<commit_message>
Concurrency: Update chap 3
</commit_message>
<xml_diff>
--- a/Concurrency/Document/1.docx
+++ b/Concurrency/Document/1.docx
@@ -55,87 +55,7 @@
           <w:sz w:val="40"/>
           <w:szCs w:val="40"/>
         </w:rPr>
-        <w:t xml:space="preserve">-In ancient past, computers executed a single program from </w:t>
-      </w:r>
-      <w:proofErr w:type="gramStart"/>
-      <w:r>
-        <w:rPr>
-          <w:sz w:val="40"/>
-          <w:szCs w:val="40"/>
-        </w:rPr>
-        <w:t>begin</w:t>
-      </w:r>
-      <w:proofErr w:type="gramEnd"/>
-      <w:r>
-        <w:rPr>
-          <w:sz w:val="40"/>
-          <w:szCs w:val="40"/>
-        </w:rPr>
-        <w:t xml:space="preserve"> to end and that program </w:t>
-      </w:r>
-      <w:proofErr w:type="gramStart"/>
-      <w:r>
-        <w:rPr>
-          <w:sz w:val="40"/>
-          <w:szCs w:val="40"/>
-        </w:rPr>
-        <w:t>direct</w:t>
-      </w:r>
-      <w:proofErr w:type="gramEnd"/>
-      <w:r>
-        <w:rPr>
-          <w:sz w:val="40"/>
-          <w:szCs w:val="40"/>
-        </w:rPr>
-        <w:t xml:space="preserve"> </w:t>
-      </w:r>
-      <w:proofErr w:type="gramStart"/>
-      <w:r>
-        <w:rPr>
-          <w:sz w:val="40"/>
-          <w:szCs w:val="40"/>
-        </w:rPr>
-        <w:t>access</w:t>
-      </w:r>
-      <w:proofErr w:type="gramEnd"/>
-      <w:r>
-        <w:rPr>
-          <w:sz w:val="40"/>
-          <w:szCs w:val="40"/>
-        </w:rPr>
-        <w:t xml:space="preserve"> all </w:t>
-      </w:r>
-      <w:proofErr w:type="gramStart"/>
-      <w:r>
-        <w:rPr>
-          <w:sz w:val="40"/>
-          <w:szCs w:val="40"/>
-        </w:rPr>
-        <w:t>resource</w:t>
-      </w:r>
-      <w:proofErr w:type="gramEnd"/>
-      <w:r>
-        <w:rPr>
-          <w:sz w:val="40"/>
-          <w:szCs w:val="40"/>
-        </w:rPr>
-        <w:t xml:space="preserve"> of </w:t>
-      </w:r>
-      <w:proofErr w:type="gramStart"/>
-      <w:r>
-        <w:rPr>
-          <w:sz w:val="40"/>
-          <w:szCs w:val="40"/>
-        </w:rPr>
-        <w:t>machine</w:t>
-      </w:r>
-      <w:proofErr w:type="gramEnd"/>
-      <w:r>
-        <w:rPr>
-          <w:sz w:val="40"/>
-          <w:szCs w:val="40"/>
-        </w:rPr>
-        <w:t>.</w:t>
+        <w:t>-In ancient past, computers executed a single program from begin to end and that program direct access all resource of machine.</w:t>
       </w:r>
     </w:p>
     <w:p>
@@ -287,23 +207,7 @@
           <w:szCs w:val="40"/>
         </w:rPr>
         <w:lastRenderedPageBreak/>
-        <w:t xml:space="preserve">-Threads are called lightweight processes, </w:t>
-      </w:r>
-      <w:proofErr w:type="gramStart"/>
-      <w:r>
-        <w:rPr>
-          <w:sz w:val="40"/>
-          <w:szCs w:val="40"/>
-        </w:rPr>
-        <w:t>most</w:t>
-      </w:r>
-      <w:proofErr w:type="gramEnd"/>
-      <w:r>
-        <w:rPr>
-          <w:sz w:val="40"/>
-          <w:szCs w:val="40"/>
-        </w:rPr>
-        <w:t xml:space="preserve"> modern OS treat threads as the basic unit of scheduling.</w:t>
+        <w:t>-Threads are called lightweight processes, most modern OS treat threads as the basic unit of scheduling.</w:t>
       </w:r>
     </w:p>
     <w:p>
@@ -417,15 +321,7 @@
           <w:sz w:val="40"/>
           <w:szCs w:val="40"/>
         </w:rPr>
-        <w:t xml:space="preserve">-Multiple threads also achieve better on single-processor systems. Another thread can still run while </w:t>
-      </w:r>
-      <w:proofErr w:type="gramStart"/>
-      <w:r>
-        <w:rPr>
-          <w:sz w:val="40"/>
-          <w:szCs w:val="40"/>
-        </w:rPr>
-        <w:t>1</w:t>
+        <w:t>-Multiple threads also achieve better on single-processor systems. Another thread can still run while 1</w:t>
       </w:r>
       <w:r>
         <w:rPr>
@@ -435,45 +331,12 @@
         </w:rPr>
         <w:t>st</w:t>
       </w:r>
-      <w:proofErr w:type="gramEnd"/>
-      <w:r>
-        <w:rPr>
-          <w:sz w:val="40"/>
-          <w:szCs w:val="40"/>
-        </w:rPr>
-        <w:t xml:space="preserve"> thread is waiting for I/O to complete, </w:t>
-      </w:r>
-      <w:proofErr w:type="gramStart"/>
-      <w:r>
-        <w:rPr>
-          <w:sz w:val="40"/>
-          <w:szCs w:val="40"/>
-        </w:rPr>
-        <w:t>allow</w:t>
-      </w:r>
-      <w:proofErr w:type="gramEnd"/>
-      <w:r>
-        <w:rPr>
-          <w:sz w:val="40"/>
-          <w:szCs w:val="40"/>
-        </w:rPr>
-        <w:t xml:space="preserve"> </w:t>
-      </w:r>
-      <w:proofErr w:type="gramStart"/>
-      <w:r>
-        <w:rPr>
-          <w:sz w:val="40"/>
-          <w:szCs w:val="40"/>
-        </w:rPr>
-        <w:t>app</w:t>
-      </w:r>
-      <w:proofErr w:type="gramEnd"/>
-      <w:r>
-        <w:rPr>
-          <w:sz w:val="40"/>
-          <w:szCs w:val="40"/>
-        </w:rPr>
-        <w:t xml:space="preserve"> to make progress during blocking I/O</w:t>
+      <w:r>
+        <w:rPr>
+          <w:sz w:val="40"/>
+          <w:szCs w:val="40"/>
+        </w:rPr>
+        <w:t xml:space="preserve"> thread is waiting for I/O to complete, allow app to make progress during blocking I/O</w:t>
       </w:r>
     </w:p>
     <w:p>
@@ -513,7 +376,23 @@
           <w:sz w:val="40"/>
           <w:szCs w:val="40"/>
         </w:rPr>
-        <w:t xml:space="preserve">workflows each running in a separate thread, </w:t>
+        <w:t>workflows each running in a separate thread, interact only with each other at specific synchronization points</w:t>
+      </w:r>
+    </w:p>
+    <w:p>
+      <w:pPr>
+        <w:spacing w:line="240" w:lineRule="auto"/>
+        <w:rPr>
+          <w:sz w:val="40"/>
+          <w:szCs w:val="40"/>
+        </w:rPr>
+      </w:pPr>
+      <w:r>
+        <w:rPr>
+          <w:sz w:val="40"/>
+          <w:szCs w:val="40"/>
+        </w:rPr>
+        <w:t xml:space="preserve">-This benefit exploited by frameworks like servlet or RMI. Framework handles details of request management, thread creation, and load balancing, dispatching portions of request handling to appropriate application </w:t>
       </w:r>
       <w:proofErr w:type="gramStart"/>
       <w:r>
@@ -521,7 +400,7 @@
           <w:sz w:val="40"/>
           <w:szCs w:val="40"/>
         </w:rPr>
-        <w:t>interact</w:t>
+        <w:t>component  at</w:t>
       </w:r>
       <w:proofErr w:type="gramEnd"/>
       <w:r>
@@ -529,71 +408,7 @@
           <w:sz w:val="40"/>
           <w:szCs w:val="40"/>
         </w:rPr>
-        <w:t xml:space="preserve"> only with each other at specific synchronization points</w:t>
-      </w:r>
-    </w:p>
-    <w:p>
-      <w:pPr>
-        <w:spacing w:line="240" w:lineRule="auto"/>
-        <w:rPr>
-          <w:sz w:val="40"/>
-          <w:szCs w:val="40"/>
-        </w:rPr>
-      </w:pPr>
-      <w:r>
-        <w:rPr>
-          <w:sz w:val="40"/>
-          <w:szCs w:val="40"/>
-        </w:rPr>
-        <w:t xml:space="preserve">-This benefit </w:t>
-      </w:r>
-      <w:proofErr w:type="gramStart"/>
-      <w:r>
-        <w:rPr>
-          <w:sz w:val="40"/>
-          <w:szCs w:val="40"/>
-        </w:rPr>
-        <w:t>exploited</w:t>
-      </w:r>
-      <w:proofErr w:type="gramEnd"/>
-      <w:r>
-        <w:rPr>
-          <w:sz w:val="40"/>
-          <w:szCs w:val="40"/>
-        </w:rPr>
-        <w:t xml:space="preserve"> by frameworks like servlet or RMI. Framework handles details of request management, thread creation, and load balancing, dispatching portions of request handling to appropriate application </w:t>
-      </w:r>
-      <w:proofErr w:type="gramStart"/>
-      <w:r>
-        <w:rPr>
-          <w:sz w:val="40"/>
-          <w:szCs w:val="40"/>
-        </w:rPr>
-        <w:t>component  at</w:t>
-      </w:r>
-      <w:proofErr w:type="gramEnd"/>
-      <w:r>
-        <w:rPr>
-          <w:sz w:val="40"/>
-          <w:szCs w:val="40"/>
-        </w:rPr>
-        <w:t xml:space="preserve"> appropriate point in </w:t>
-      </w:r>
-      <w:proofErr w:type="gramStart"/>
-      <w:r>
-        <w:rPr>
-          <w:sz w:val="40"/>
-          <w:szCs w:val="40"/>
-        </w:rPr>
-        <w:t>work-flow</w:t>
-      </w:r>
-      <w:proofErr w:type="gramEnd"/>
-      <w:r>
-        <w:rPr>
-          <w:sz w:val="40"/>
-          <w:szCs w:val="40"/>
-        </w:rPr>
-        <w:t>.</w:t>
+        <w:t xml:space="preserve"> appropriate point in work-flow.</w:t>
       </w:r>
     </w:p>
     <w:p>
@@ -641,58 +456,9 @@
           <w:sz w:val="40"/>
           <w:szCs w:val="40"/>
         </w:rPr>
-        <w:t xml:space="preserve">-If an app </w:t>
-      </w:r>
-      <w:proofErr w:type="gramStart"/>
-      <w:r>
-        <w:rPr>
-          <w:sz w:val="40"/>
-          <w:szCs w:val="40"/>
-        </w:rPr>
-        <w:t>read</w:t>
-      </w:r>
-      <w:proofErr w:type="gramEnd"/>
-      <w:r>
-        <w:rPr>
-          <w:sz w:val="40"/>
-          <w:szCs w:val="40"/>
-        </w:rPr>
-        <w:t xml:space="preserve"> from a socket when </w:t>
-      </w:r>
-      <w:proofErr w:type="gramStart"/>
-      <w:r>
-        <w:rPr>
-          <w:sz w:val="40"/>
-          <w:szCs w:val="40"/>
-        </w:rPr>
-        <w:t>no</w:t>
-      </w:r>
-      <w:proofErr w:type="gramEnd"/>
-      <w:r>
-        <w:rPr>
-          <w:sz w:val="40"/>
-          <w:szCs w:val="40"/>
-        </w:rPr>
-        <w:t xml:space="preserve"> data, read blocks until data </w:t>
-      </w:r>
-      <w:proofErr w:type="gramStart"/>
-      <w:r>
-        <w:rPr>
-          <w:sz w:val="40"/>
-          <w:szCs w:val="40"/>
-        </w:rPr>
-        <w:t>available</w:t>
-      </w:r>
-      <w:proofErr w:type="gramEnd"/>
-      <w:r>
-        <w:rPr>
-          <w:sz w:val="40"/>
-          <w:szCs w:val="40"/>
-        </w:rPr>
-        <w:t xml:space="preserve">.  If each request has </w:t>
+        <w:t xml:space="preserve">-If an app read from a socket when no data, read blocks until data available.  If each request has </w:t>
       </w:r>
       <w:proofErr w:type="spellStart"/>
-      <w:proofErr w:type="gramStart"/>
       <w:r>
         <w:rPr>
           <w:sz w:val="40"/>
@@ -701,7 +467,6 @@
         <w:t>is</w:t>
       </w:r>
       <w:proofErr w:type="spellEnd"/>
-      <w:proofErr w:type="gramEnd"/>
       <w:r>
         <w:rPr>
           <w:sz w:val="40"/>
@@ -829,25 +594,7 @@
           <w:sz w:val="40"/>
           <w:szCs w:val="40"/>
         </w:rPr>
-        <w:t xml:space="preserve"> dispatch thread. When a UI event occurs, event handlers are called in event thread. Most GUI frameworks are single-threaded subsystems, so </w:t>
-      </w:r>
-      <w:proofErr w:type="gramStart"/>
-      <w:r>
-        <w:rPr>
-          <w:rFonts w:ascii="Calibri" w:hAnsi="Calibri" w:cs="Calibri"/>
-          <w:sz w:val="40"/>
-          <w:szCs w:val="40"/>
-        </w:rPr>
-        <w:t>main</w:t>
-      </w:r>
-      <w:proofErr w:type="gramEnd"/>
-      <w:r>
-        <w:rPr>
-          <w:rFonts w:ascii="Calibri" w:hAnsi="Calibri" w:cs="Calibri"/>
-          <w:sz w:val="40"/>
-          <w:szCs w:val="40"/>
-        </w:rPr>
-        <w:t xml:space="preserve"> event loop is still present, but it runs in its own thread</w:t>
+        <w:t xml:space="preserve"> dispatch thread. When a UI event occurs, event handlers are called in event thread. Most GUI frameworks are single-threaded subsystems, so main event loop is still present, but it runs in its own thread</w:t>
       </w:r>
     </w:p>
     <w:p>
@@ -1042,25 +789,7 @@
           <w:sz w:val="40"/>
           <w:szCs w:val="40"/>
         </w:rPr>
-        <w:t xml:space="preserve">+This behaves correctly in </w:t>
-      </w:r>
-      <w:proofErr w:type="gramStart"/>
-      <w:r>
-        <w:rPr>
-          <w:rFonts w:ascii="Calibri" w:hAnsi="Calibri" w:cs="Calibri"/>
-          <w:sz w:val="40"/>
-          <w:szCs w:val="40"/>
-        </w:rPr>
-        <w:t>single</w:t>
-      </w:r>
-      <w:proofErr w:type="gramEnd"/>
-      <w:r>
-        <w:rPr>
-          <w:rFonts w:ascii="Calibri" w:hAnsi="Calibri" w:cs="Calibri"/>
-          <w:sz w:val="40"/>
-          <w:szCs w:val="40"/>
-        </w:rPr>
-        <w:t>-threaded environment, but not in multithreaded.</w:t>
+        <w:t>+This behaves correctly in single-threaded environment, but not in multithreaded.</w:t>
       </w:r>
     </w:p>
     <w:p>
@@ -1350,25 +1079,7 @@
           <w:sz w:val="40"/>
           <w:szCs w:val="40"/>
         </w:rPr>
-        <w:t xml:space="preserve"> </w:t>
-      </w:r>
-      <w:proofErr w:type="gramStart"/>
-      <w:r>
-        <w:rPr>
-          <w:rFonts w:ascii="Calibri" w:hAnsi="Calibri" w:cs="Calibri"/>
-          <w:sz w:val="40"/>
-          <w:szCs w:val="40"/>
-        </w:rPr>
-        <w:t>same</w:t>
-      </w:r>
-      <w:proofErr w:type="gramEnd"/>
-      <w:r>
-        <w:rPr>
-          <w:rFonts w:ascii="Calibri" w:hAnsi="Calibri" w:cs="Calibri"/>
-          <w:sz w:val="40"/>
-          <w:szCs w:val="40"/>
-        </w:rPr>
-        <w:t xml:space="preserve"> </w:t>
+        <w:t xml:space="preserve"> same </w:t>
       </w:r>
       <w:r>
         <w:rPr>
@@ -1404,25 +1115,7 @@
           <w:sz w:val="40"/>
           <w:szCs w:val="40"/>
         </w:rPr>
-        <w:t xml:space="preserve">-&gt;they can access or modify variables that other threads might be using, </w:t>
-      </w:r>
-      <w:proofErr w:type="gramStart"/>
-      <w:r>
-        <w:rPr>
-          <w:rFonts w:ascii="Calibri" w:hAnsi="Calibri" w:cs="Calibri"/>
-          <w:sz w:val="40"/>
-          <w:szCs w:val="40"/>
-        </w:rPr>
-        <w:t>make</w:t>
-      </w:r>
-      <w:proofErr w:type="gramEnd"/>
-      <w:r>
-        <w:rPr>
-          <w:rFonts w:ascii="Calibri" w:hAnsi="Calibri" w:cs="Calibri"/>
-          <w:sz w:val="40"/>
-          <w:szCs w:val="40"/>
-        </w:rPr>
-        <w:t xml:space="preserve"> them confused by having </w:t>
+        <w:t xml:space="preserve">-&gt;they can access or modify variables that other threads might be using, make them confused by having </w:t>
       </w:r>
       <w:r>
         <w:rPr>
@@ -1668,6 +1361,43 @@
           <w:sz w:val="40"/>
           <w:szCs w:val="40"/>
         </w:rPr>
+        <w:t>+Example: sequential programs in an infinite loop, where the code that follows the loop never gets executed.</w:t>
+      </w:r>
+    </w:p>
+    <w:p>
+      <w:pPr>
+        <w:spacing w:line="240" w:lineRule="auto"/>
+        <w:rPr>
+          <w:rFonts w:ascii="Calibri" w:hAnsi="Calibri" w:cs="Calibri"/>
+          <w:sz w:val="40"/>
+          <w:szCs w:val="40"/>
+        </w:rPr>
+      </w:pPr>
+      <w:r>
+        <w:rPr>
+          <w:rFonts w:ascii="Calibri" w:hAnsi="Calibri" w:cs="Calibri"/>
+          <w:sz w:val="40"/>
+          <w:szCs w:val="40"/>
+        </w:rPr>
+        <w:lastRenderedPageBreak/>
+        <w:t>+Example: thread A waiting resources that thread B holds, B never releases it, A waits forever.</w:t>
+      </w:r>
+    </w:p>
+    <w:p>
+      <w:pPr>
+        <w:spacing w:line="240" w:lineRule="auto"/>
+        <w:rPr>
+          <w:rFonts w:ascii="Calibri" w:hAnsi="Calibri" w:cs="Calibri"/>
+          <w:sz w:val="40"/>
+          <w:szCs w:val="40"/>
+        </w:rPr>
+      </w:pPr>
+      <w:r>
+        <w:rPr>
+          <w:rFonts w:ascii="Calibri" w:hAnsi="Calibri" w:cs="Calibri"/>
+          <w:sz w:val="40"/>
+          <w:szCs w:val="40"/>
+        </w:rPr>
         <w:t xml:space="preserve">-Like most concurrency bugs, bugs causing liveness failures can be elusive </w:t>
       </w:r>
       <w:r>
@@ -1676,34 +1406,7 @@
           <w:sz w:val="40"/>
           <w:szCs w:val="40"/>
         </w:rPr>
-        <w:t xml:space="preserve">as they depend on relative timing </w:t>
-      </w:r>
-      <w:r>
-        <w:rPr>
-          <w:rFonts w:ascii="Calibri" w:hAnsi="Calibri" w:cs="Calibri"/>
-          <w:sz w:val="40"/>
-          <w:szCs w:val="40"/>
-        </w:rPr>
-        <w:lastRenderedPageBreak/>
-        <w:t xml:space="preserve">of </w:t>
-      </w:r>
-      <w:proofErr w:type="gramStart"/>
-      <w:r>
-        <w:rPr>
-          <w:rFonts w:ascii="Calibri" w:hAnsi="Calibri" w:cs="Calibri"/>
-          <w:sz w:val="40"/>
-          <w:szCs w:val="40"/>
-        </w:rPr>
-        <w:t>event</w:t>
-      </w:r>
-      <w:proofErr w:type="gramEnd"/>
-      <w:r>
-        <w:rPr>
-          <w:rFonts w:ascii="Calibri" w:hAnsi="Calibri" w:cs="Calibri"/>
-          <w:sz w:val="40"/>
-          <w:szCs w:val="40"/>
-        </w:rPr>
-        <w:t xml:space="preserve"> in different threads, so don’t always manifest themselves in development or testing.</w:t>
+        <w:t>as they depend on relative timing of event in different threads, so don’t always manifest themselves in development or testing.</w:t>
       </w:r>
     </w:p>
     <w:p>
@@ -1773,79 +1476,25 @@
           <w:sz w:val="40"/>
           <w:szCs w:val="40"/>
         </w:rPr>
-        <w:t xml:space="preserve">: scheduler suspends the active thread temporarily so another thread can run. They have significant costs: </w:t>
-      </w:r>
-      <w:proofErr w:type="gramStart"/>
-      <w:r>
-        <w:rPr>
-          <w:rFonts w:ascii="Calibri" w:hAnsi="Calibri" w:cs="Calibri"/>
-          <w:sz w:val="40"/>
-          <w:szCs w:val="40"/>
-        </w:rPr>
-        <w:t>save</w:t>
-      </w:r>
-      <w:proofErr w:type="gramEnd"/>
-      <w:r>
-        <w:rPr>
-          <w:rFonts w:ascii="Calibri" w:hAnsi="Calibri" w:cs="Calibri"/>
-          <w:sz w:val="40"/>
-          <w:szCs w:val="40"/>
-        </w:rPr>
-        <w:t xml:space="preserve"> and </w:t>
-      </w:r>
-      <w:proofErr w:type="gramStart"/>
-      <w:r>
-        <w:rPr>
-          <w:rFonts w:ascii="Calibri" w:hAnsi="Calibri" w:cs="Calibri"/>
-          <w:sz w:val="40"/>
-          <w:szCs w:val="40"/>
-        </w:rPr>
-        <w:t>restore</w:t>
-      </w:r>
-      <w:proofErr w:type="gramEnd"/>
-      <w:r>
-        <w:rPr>
-          <w:rFonts w:ascii="Calibri" w:hAnsi="Calibri" w:cs="Calibri"/>
-          <w:sz w:val="40"/>
-          <w:szCs w:val="40"/>
-        </w:rPr>
-        <w:t xml:space="preserve"> execution context, loss locality, CPU time spent scheduling threads instead of running them.</w:t>
-      </w:r>
-    </w:p>
-    <w:p>
-      <w:pPr>
-        <w:spacing w:line="240" w:lineRule="auto"/>
-        <w:rPr>
-          <w:rFonts w:ascii="Calibri" w:hAnsi="Calibri" w:cs="Calibri"/>
-          <w:sz w:val="40"/>
-          <w:szCs w:val="40"/>
-        </w:rPr>
-      </w:pPr>
-      <w:r>
-        <w:rPr>
-          <w:rFonts w:ascii="Calibri" w:hAnsi="Calibri" w:cs="Calibri"/>
-          <w:sz w:val="40"/>
-          <w:szCs w:val="40"/>
-        </w:rPr>
-        <w:t xml:space="preserve">-When threads share data, </w:t>
-      </w:r>
-      <w:proofErr w:type="gramStart"/>
-      <w:r>
-        <w:rPr>
-          <w:rFonts w:ascii="Calibri" w:hAnsi="Calibri" w:cs="Calibri"/>
-          <w:sz w:val="40"/>
-          <w:szCs w:val="40"/>
-        </w:rPr>
-        <w:t>must</w:t>
-      </w:r>
-      <w:proofErr w:type="gramEnd"/>
-      <w:r>
-        <w:rPr>
-          <w:rFonts w:ascii="Calibri" w:hAnsi="Calibri" w:cs="Calibri"/>
-          <w:sz w:val="40"/>
-          <w:szCs w:val="40"/>
-        </w:rPr>
-        <w:t xml:space="preserve"> use synchronization mechanisms to inhibit compiler optimization, flush or invalidate memory caches, create synchronization traffic on shared memory bus.</w:t>
+        <w:t>: scheduler suspends the active thread temporarily so another thread can run. They have significant costs: save and restore execution context, loss locality, CPU time spent scheduling threads instead of running them.</w:t>
+      </w:r>
+    </w:p>
+    <w:p>
+      <w:pPr>
+        <w:spacing w:line="240" w:lineRule="auto"/>
+        <w:rPr>
+          <w:rFonts w:ascii="Calibri" w:hAnsi="Calibri" w:cs="Calibri"/>
+          <w:sz w:val="40"/>
+          <w:szCs w:val="40"/>
+        </w:rPr>
+      </w:pPr>
+      <w:r>
+        <w:rPr>
+          <w:rFonts w:ascii="Calibri" w:hAnsi="Calibri" w:cs="Calibri"/>
+          <w:sz w:val="40"/>
+          <w:szCs w:val="40"/>
+        </w:rPr>
+        <w:t>-When threads share data, must use synchronization mechanisms to inhibit compiler optimization, flush or invalidate memory caches, create synchronization traffic on shared memory bus.</w:t>
       </w:r>
     </w:p>
     <w:p>
@@ -1897,7 +1546,16 @@
           <w:sz w:val="40"/>
           <w:szCs w:val="40"/>
         </w:rPr>
-        <w:t>-Every Java app uses threads. When JVM starts, it creates threads for JVM housekeeping tasks (garbage collection, finalization)</w:t>
+        <w:t xml:space="preserve">-Every Java app uses threads. When JVM starts, it creates threads for JVM housekeeping tasks (garbage collection, </w:t>
+      </w:r>
+      <w:r>
+        <w:rPr>
+          <w:rFonts w:ascii="Calibri" w:hAnsi="Calibri" w:cs="Calibri"/>
+          <w:sz w:val="40"/>
+          <w:szCs w:val="40"/>
+        </w:rPr>
+        <w:lastRenderedPageBreak/>
+        <w:t>finalization)</w:t>
       </w:r>
       <w:r>
         <w:rPr>
@@ -1951,7 +1609,6 @@
           <w:sz w:val="40"/>
           <w:szCs w:val="40"/>
         </w:rPr>
-        <w:lastRenderedPageBreak/>
         <w:t>pools of threads</w:t>
       </w:r>
       <w:r>
@@ -1996,61 +1653,7 @@
           <w:sz w:val="40"/>
           <w:szCs w:val="40"/>
         </w:rPr>
-        <w:t xml:space="preserve"> designed to handle all infrastructure of deploying web app and dispatching </w:t>
-      </w:r>
-      <w:proofErr w:type="gramStart"/>
-      <w:r>
-        <w:rPr>
-          <w:rFonts w:ascii="Calibri" w:hAnsi="Calibri" w:cs="Calibri"/>
-          <w:sz w:val="40"/>
-          <w:szCs w:val="40"/>
-        </w:rPr>
-        <w:t>request</w:t>
-      </w:r>
-      <w:proofErr w:type="gramEnd"/>
-      <w:r>
-        <w:rPr>
-          <w:rFonts w:ascii="Calibri" w:hAnsi="Calibri" w:cs="Calibri"/>
-          <w:sz w:val="40"/>
-          <w:szCs w:val="40"/>
-        </w:rPr>
-        <w:t xml:space="preserve"> from remote HTTP clients. A request arriving at </w:t>
-      </w:r>
-      <w:proofErr w:type="gramStart"/>
-      <w:r>
-        <w:rPr>
-          <w:rFonts w:ascii="Calibri" w:hAnsi="Calibri" w:cs="Calibri"/>
-          <w:sz w:val="40"/>
-          <w:szCs w:val="40"/>
-        </w:rPr>
-        <w:t>server</w:t>
-      </w:r>
-      <w:proofErr w:type="gramEnd"/>
-      <w:r>
-        <w:rPr>
-          <w:rFonts w:ascii="Calibri" w:hAnsi="Calibri" w:cs="Calibri"/>
-          <w:sz w:val="40"/>
-          <w:szCs w:val="40"/>
-        </w:rPr>
-        <w:t xml:space="preserve"> is dispatched, perhaps through a chain of filter, to </w:t>
-      </w:r>
-      <w:proofErr w:type="gramStart"/>
-      <w:r>
-        <w:rPr>
-          <w:rFonts w:ascii="Calibri" w:hAnsi="Calibri" w:cs="Calibri"/>
-          <w:sz w:val="40"/>
-          <w:szCs w:val="40"/>
-        </w:rPr>
-        <w:t>appropriate</w:t>
-      </w:r>
-      <w:proofErr w:type="gramEnd"/>
-      <w:r>
-        <w:rPr>
-          <w:rFonts w:ascii="Calibri" w:hAnsi="Calibri" w:cs="Calibri"/>
-          <w:sz w:val="40"/>
-          <w:szCs w:val="40"/>
-        </w:rPr>
-        <w:t xml:space="preserve"> servlet or JSP. Each servlet represents a component of app logic, and in high-volume web sites, multiple clients may require the services of same servlet at once. The servlets specification requires that a servlet be prepared to be called simultaneously from multiple threads.</w:t>
+        <w:t xml:space="preserve"> designed to handle all infrastructure of deploying web app and dispatching request from remote HTTP clients. A request arriving at server is dispatched, perhaps through a chain of filter, to appropriate servlet or JSP. Each servlet represents a component of app logic, and in high-volume web sites, multiple clients may require the services of same servlet at once. The servlets specification requires that a servlet be prepared to be called simultaneously from multiple threads.</w:t>
       </w:r>
       <w:r>
         <w:rPr>

</xml_diff>